<commit_message>
Actualizar GuiaICA e imagenes matematicas
</commit_message>
<xml_diff>
--- a/plantillas/GuíaICA.docx
+++ b/plantillas/GuíaICA.docx
@@ -16,126 +16,7 @@
         </w:rPr>
       </w:pPr>
       <w:r>
-        <w:rPr>
-          <w:b/>
-          <w:bCs/>
-          <w:sz w:val="28"/>
-          <w:szCs w:val="28"/>
-        </w:rPr>
-        <w:t>INSTITUTO DE CIENCIAS AYSÉN</w:t>
-      </w:r>
-    </w:p>
-    <w:p>
-      <w:pPr>
-        <w:pStyle w:val="BodyText"/>
-        <w:bidi w:val="0"/>
-        <w:spacing w:before="0" w:after="140"/>
-        <w:jc w:val="center"/>
         <w:rPr/>
-      </w:pPr>
-      <w:r>
-        <w:rPr>
-          <w:b/>
-          <w:bCs/>
-          <w:i/>
-          <w:iCs/>
-        </w:rPr>
-        <w:t>GUÍA DE APRENDIZAJE</w:t>
-      </w:r>
-    </w:p>
-    <w:p>
-      <w:pPr>
-        <w:pStyle w:val="BodyText"/>
-        <w:bidi w:val="0"/>
-        <w:spacing w:before="0" w:after="140"/>
-        <w:jc w:val="start"/>
-        <w:rPr/>
-      </w:pPr>
-      <w:r>
-        <w:rPr/>
-      </w:r>
-    </w:p>
-    <w:p>
-      <w:pPr>
-        <w:pStyle w:val="BodyText"/>
-        <w:bidi w:val="0"/>
-        <w:spacing w:before="0" w:after="140"/>
-        <w:jc w:val="start"/>
-        <w:rPr/>
-      </w:pPr>
-      <w:r>
-        <w:rPr/>
-        <w:t>Título:</w:t>
-      </w:r>
-    </w:p>
-    <w:p>
-      <w:pPr>
-        <w:pStyle w:val="BodyText"/>
-        <w:bidi w:val="0"/>
-        <w:spacing w:before="0" w:after="140"/>
-        <w:jc w:val="start"/>
-        <w:rPr/>
-      </w:pPr>
-      <w:r>
-        <w:rPr/>
-        <w:t>Curso:</w:t>
-      </w:r>
-    </w:p>
-    <w:p>
-      <w:pPr>
-        <w:pStyle w:val="BodyText"/>
-        <w:bidi w:val="0"/>
-        <w:spacing w:before="0" w:after="140"/>
-        <w:jc w:val="start"/>
-        <w:rPr/>
-      </w:pPr>
-      <w:r>
-        <w:rPr/>
-        <w:t>Asignatura:</w:t>
-      </w:r>
-    </w:p>
-    <w:p>
-      <w:pPr>
-        <w:pStyle w:val="BodyText"/>
-        <w:bidi w:val="0"/>
-        <w:spacing w:before="0" w:after="140"/>
-        <w:jc w:val="start"/>
-        <w:rPr/>
-      </w:pPr>
-      <w:r>
-        <w:rPr/>
-        <w:t>Objetivo:</w:t>
-      </w:r>
-    </w:p>
-    <w:p>
-      <w:pPr>
-        <w:pStyle w:val="BodyText"/>
-        <w:bidi w:val="0"/>
-        <w:spacing w:before="0" w:after="140"/>
-        <w:jc w:val="start"/>
-        <w:rPr/>
-      </w:pPr>
-      <w:r>
-        <w:rPr/>
-      </w:r>
-    </w:p>
-    <w:p>
-      <w:pPr>
-        <w:pStyle w:val="BodyText"/>
-        <w:bidi w:val="0"/>
-        <w:spacing w:before="0" w:after="140"/>
-        <w:jc w:val="start"/>
-        <w:rPr>
-          <w:b/>
-          <w:bCs/>
-        </w:rPr>
-      </w:pPr>
-      <w:r>
-        <w:rPr>
-          <w:b/>
-          <w:bCs/>
-        </w:rPr>
-        <w:t>CONTENIDO:</w:t>
       </w:r>
     </w:p>
     <w:sectPr>
@@ -1010,7 +891,7 @@
   </w:style>
   <w:style w:type="paragraph" w:styleId="Heading1">
     <w:name w:val="heading 1"/>
-    <w:basedOn w:val="Ttulo"/>
+    <w:basedOn w:val="Ttulouser"/>
     <w:next w:val="BodyText"/>
     <w:qFormat/>
     <w:pPr>
@@ -1027,7 +908,7 @@
   </w:style>
   <w:style w:type="paragraph" w:styleId="Heading2">
     <w:name w:val="heading 2"/>
-    <w:basedOn w:val="Ttulo"/>
+    <w:basedOn w:val="Ttulouser"/>
     <w:next w:val="BodyText"/>
     <w:qFormat/>
     <w:pPr>
@@ -1044,7 +925,7 @@
   </w:style>
   <w:style w:type="paragraph" w:styleId="Heading3">
     <w:name w:val="heading 3"/>
-    <w:basedOn w:val="Ttulo"/>
+    <w:basedOn w:val="Ttulouser"/>
     <w:next w:val="BodyText"/>
     <w:qFormat/>
     <w:pPr>
@@ -1151,8 +1032,8 @@
       <w:rFonts w:eastAsia="ＭＳ 明朝" w:cs="Lohit Devanagari"/>
     </w:rPr>
   </w:style>
-  <w:style w:type="paragraph" w:styleId="Lneahorizontal">
-    <w:name w:val="Línea horizontal"/>
+  <w:style w:type="paragraph" w:styleId="Lneahorizontaluser">
+    <w:name w:val="Línea horizontal (user)"/>
     <w:basedOn w:val="Normal"/>
     <w:next w:val="BodyText"/>
     <w:qFormat/>
@@ -1168,8 +1049,8 @@
       <w:szCs w:val="12"/>
     </w:rPr>
   </w:style>
-  <w:style w:type="paragraph" w:styleId="Contenidodelatabla">
-    <w:name w:val="Contenido de la tabla"/>
+  <w:style w:type="paragraph" w:styleId="Contenidodelatablauser">
+    <w:name w:val="Contenido de la tabla (user)"/>
     <w:basedOn w:val="Normal"/>
     <w:qFormat/>
     <w:pPr>
@@ -1178,9 +1059,9 @@
     </w:pPr>
     <w:rPr/>
   </w:style>
-  <w:style w:type="paragraph" w:styleId="Ttulodelatabla">
-    <w:name w:val="Título de la tabla"/>
-    <w:basedOn w:val="Contenidodelatabla"/>
+  <w:style w:type="paragraph" w:styleId="Ttulodelatablauser">
+    <w:name w:val="Título de la tabla (user)"/>
+    <w:basedOn w:val="Contenidodelatablauser"/>
     <w:qFormat/>
     <w:pPr>
       <w:suppressLineNumbers/>
@@ -1191,8 +1072,8 @@
       <w:bCs/>
     </w:rPr>
   </w:style>
-  <w:style w:type="paragraph" w:styleId="Cabeceraypieuser">
-    <w:name w:val="Cabecera y pie (user)"/>
+  <w:style w:type="paragraph" w:styleId="Cabeceraypie">
+    <w:name w:val="Cabecera y pie"/>
     <w:basedOn w:val="Normal"/>
     <w:qFormat/>
     <w:pPr>
@@ -1205,8 +1086,8 @@
     </w:pPr>
     <w:rPr/>
   </w:style>
-  <w:style w:type="paragraph" w:styleId="Cabeceraypie">
-    <w:name w:val="Cabecera y pie"/>
+  <w:style w:type="paragraph" w:styleId="Cabeceraypieuser">
+    <w:name w:val="Cabecera y pie (user)"/>
     <w:basedOn w:val="Normal"/>
     <w:qFormat/>
     <w:pPr/>
@@ -1214,7 +1095,7 @@
   </w:style>
   <w:style w:type="paragraph" w:styleId="Header">
     <w:name w:val="header"/>
-    <w:basedOn w:val="Cabeceraypieuser"/>
+    <w:basedOn w:val="Cabeceraypie"/>
     <w:pPr>
       <w:suppressLineNumbers/>
     </w:pPr>
@@ -1222,7 +1103,7 @@
   </w:style>
   <w:style w:type="paragraph" w:styleId="Footer">
     <w:name w:val="footer"/>
-    <w:basedOn w:val="Cabeceraypieuser"/>
+    <w:basedOn w:val="Cabeceraypie"/>
     <w:pPr>
       <w:suppressLineNumbers/>
     </w:pPr>

</xml_diff>